<commit_message>
feat: RECORDEXT enterprise refinement, locked evaluation table, Times New Roman 12pt code, multi-subject support, and responsive mobile UI
</commit_message>
<xml_diff>
--- a/templates/saved_templates/AI_ML_Python_Lab_Record_Reference.docx
+++ b/templates/saved_templates/AI_ML_Python_Lab_Record_Reference.docx
@@ -137,6 +137,7 @@
     <w:p>
       <w:pPr>
         <w:spacing w:before="40" w:after="120" w:line="276" w:lineRule="auto"/>
+        <w:jc w:val="both"/>
       </w:pPr>
       <w:r>
         <w:rPr>
@@ -163,6 +164,7 @@
       <w:pPr>
         <w:spacing w:before="40" w:after="60" w:line="276" w:lineRule="auto"/>
         <w:ind w:left="576"/>
+        <w:jc w:val="both"/>
       </w:pPr>
       <w:r>
         <w:rPr>
@@ -176,6 +178,7 @@
       <w:pPr>
         <w:spacing w:before="40" w:after="60" w:line="276" w:lineRule="auto"/>
         <w:ind w:left="576"/>
+        <w:jc w:val="both"/>
       </w:pPr>
       <w:r>
         <w:rPr>
@@ -189,6 +192,7 @@
       <w:pPr>
         <w:spacing w:before="40" w:after="60" w:line="276" w:lineRule="auto"/>
         <w:ind w:left="576"/>
+        <w:jc w:val="both"/>
       </w:pPr>
       <w:r>
         <w:rPr>
@@ -202,6 +206,7 @@
       <w:pPr>
         <w:spacing w:before="40" w:after="60" w:line="276" w:lineRule="auto"/>
         <w:ind w:left="576"/>
+        <w:jc w:val="both"/>
       </w:pPr>
       <w:r>
         <w:rPr>
@@ -215,6 +220,7 @@
       <w:pPr>
         <w:spacing w:before="40" w:after="60" w:line="276" w:lineRule="auto"/>
         <w:ind w:left="576"/>
+        <w:jc w:val="both"/>
       </w:pPr>
       <w:r>
         <w:rPr>
@@ -228,6 +234,7 @@
       <w:pPr>
         <w:spacing w:before="40" w:after="60" w:line="276" w:lineRule="auto"/>
         <w:ind w:left="576"/>
+        <w:jc w:val="both"/>
       </w:pPr>
       <w:r>
         <w:rPr>
@@ -253,11 +260,12 @@
     <w:p>
       <w:pPr>
         <w:spacing w:before="0" w:after="0" w:line="252" w:lineRule="auto"/>
+        <w:jc w:val="left"/>
       </w:pPr>
       <w:r>
         <w:rPr>
-          <w:rFonts w:ascii="Courier New" w:hAnsi="Courier New"/>
-          <w:sz w:val="20"/>
+          <w:rFonts w:ascii="Times New Roman" w:hAnsi="Times New Roman"/>
+          <w:sz w:val="24"/>
         </w:rPr>
         <w:t>def get_matrix(rows, cols, name):</w:t>
       </w:r>
@@ -265,11 +273,12 @@
     <w:p>
       <w:pPr>
         <w:spacing w:before="0" w:after="0" w:line="252" w:lineRule="auto"/>
+        <w:jc w:val="left"/>
       </w:pPr>
       <w:r>
         <w:rPr>
-          <w:rFonts w:ascii="Courier New" w:hAnsi="Courier New"/>
-          <w:sz w:val="20"/>
+          <w:rFonts w:ascii="Times New Roman" w:hAnsi="Times New Roman"/>
+          <w:sz w:val="24"/>
         </w:rPr>
         <w:t xml:space="preserve">    print(f"\nEnter elements of {name}:")</w:t>
       </w:r>
@@ -277,11 +286,12 @@
     <w:p>
       <w:pPr>
         <w:spacing w:before="0" w:after="0" w:line="252" w:lineRule="auto"/>
+        <w:jc w:val="left"/>
       </w:pPr>
       <w:r>
         <w:rPr>
-          <w:rFonts w:ascii="Courier New" w:hAnsi="Courier New"/>
-          <w:sz w:val="20"/>
+          <w:rFonts w:ascii="Times New Roman" w:hAnsi="Times New Roman"/>
+          <w:sz w:val="24"/>
         </w:rPr>
         <w:t xml:space="preserve">    matrix = [</w:t>
       </w:r>
@@ -289,11 +299,12 @@
     <w:p>
       <w:pPr>
         <w:spacing w:before="0" w:after="0" w:line="252" w:lineRule="auto"/>
+        <w:jc w:val="left"/>
       </w:pPr>
       <w:r>
         <w:rPr>
-          <w:rFonts w:ascii="Courier New" w:hAnsi="Courier New"/>
-          <w:sz w:val="20"/>
+          <w:rFonts w:ascii="Times New Roman" w:hAnsi="Times New Roman"/>
+          <w:sz w:val="24"/>
         </w:rPr>
         <w:t xml:space="preserve">        [int(input(f"Enter element [{i}][{j}]: "))</w:t>
       </w:r>
@@ -301,11 +312,12 @@
     <w:p>
       <w:pPr>
         <w:spacing w:before="0" w:after="0" w:line="252" w:lineRule="auto"/>
+        <w:jc w:val="left"/>
       </w:pPr>
       <w:r>
         <w:rPr>
-          <w:rFonts w:ascii="Courier New" w:hAnsi="Courier New"/>
-          <w:sz w:val="20"/>
+          <w:rFonts w:ascii="Times New Roman" w:hAnsi="Times New Roman"/>
+          <w:sz w:val="24"/>
         </w:rPr>
         <w:t xml:space="preserve">        for j in range(cols)]</w:t>
       </w:r>
@@ -313,11 +325,12 @@
     <w:p>
       <w:pPr>
         <w:spacing w:before="0" w:after="0" w:line="252" w:lineRule="auto"/>
+        <w:jc w:val="left"/>
       </w:pPr>
       <w:r>
         <w:rPr>
-          <w:rFonts w:ascii="Courier New" w:hAnsi="Courier New"/>
-          <w:sz w:val="20"/>
+          <w:rFonts w:ascii="Times New Roman" w:hAnsi="Times New Roman"/>
+          <w:sz w:val="24"/>
         </w:rPr>
         <w:t xml:space="preserve">        for i in range(rows)</w:t>
       </w:r>
@@ -325,11 +338,12 @@
     <w:p>
       <w:pPr>
         <w:spacing w:before="0" w:after="0" w:line="252" w:lineRule="auto"/>
+        <w:jc w:val="left"/>
       </w:pPr>
       <w:r>
         <w:rPr>
-          <w:rFonts w:ascii="Courier New" w:hAnsi="Courier New"/>
-          <w:sz w:val="20"/>
+          <w:rFonts w:ascii="Times New Roman" w:hAnsi="Times New Roman"/>
+          <w:sz w:val="24"/>
         </w:rPr>
         <w:t xml:space="preserve">    ]</w:t>
       </w:r>
@@ -337,11 +351,12 @@
     <w:p>
       <w:pPr>
         <w:spacing w:before="0" w:after="0" w:line="252" w:lineRule="auto"/>
+        <w:jc w:val="left"/>
       </w:pPr>
       <w:r>
         <w:rPr>
-          <w:rFonts w:ascii="Courier New" w:hAnsi="Courier New"/>
-          <w:sz w:val="20"/>
+          <w:rFonts w:ascii="Times New Roman" w:hAnsi="Times New Roman"/>
+          <w:sz w:val="24"/>
         </w:rPr>
         <w:t xml:space="preserve">    return matrix</w:t>
       </w:r>
@@ -349,11 +364,12 @@
     <w:p>
       <w:pPr>
         <w:spacing w:before="0" w:after="0" w:line="252" w:lineRule="auto"/>
+        <w:jc w:val="left"/>
       </w:pPr>
       <w:r>
         <w:rPr>
-          <w:rFonts w:ascii="Courier New" w:hAnsi="Courier New"/>
-          <w:sz w:val="20"/>
+          <w:rFonts w:ascii="Times New Roman" w:hAnsi="Times New Roman"/>
+          <w:sz w:val="24"/>
         </w:rPr>
         <w:t xml:space="preserve"> </w:t>
       </w:r>
@@ -361,11 +377,12 @@
     <w:p>
       <w:pPr>
         <w:spacing w:before="0" w:after="0" w:line="252" w:lineRule="auto"/>
+        <w:jc w:val="left"/>
       </w:pPr>
       <w:r>
         <w:rPr>
-          <w:rFonts w:ascii="Courier New" w:hAnsi="Courier New"/>
-          <w:sz w:val="20"/>
+          <w:rFonts w:ascii="Times New Roman" w:hAnsi="Times New Roman"/>
+          <w:sz w:val="24"/>
         </w:rPr>
         <w:t>def find_high_low(matrix_A, matrix_B):</w:t>
       </w:r>
@@ -373,11 +390,12 @@
     <w:p>
       <w:pPr>
         <w:spacing w:before="0" w:after="0" w:line="252" w:lineRule="auto"/>
+        <w:jc w:val="left"/>
       </w:pPr>
       <w:r>
         <w:rPr>
-          <w:rFonts w:ascii="Courier New" w:hAnsi="Courier New"/>
-          <w:sz w:val="20"/>
+          <w:rFonts w:ascii="Times New Roman" w:hAnsi="Times New Roman"/>
+          <w:sz w:val="24"/>
         </w:rPr>
         <w:t xml:space="preserve">    elements = [</w:t>
       </w:r>
@@ -385,11 +403,12 @@
     <w:p>
       <w:pPr>
         <w:spacing w:before="0" w:after="0" w:line="252" w:lineRule="auto"/>
+        <w:jc w:val="left"/>
       </w:pPr>
       <w:r>
         <w:rPr>
-          <w:rFonts w:ascii="Courier New" w:hAnsi="Courier New"/>
-          <w:sz w:val="20"/>
+          <w:rFonts w:ascii="Times New Roman" w:hAnsi="Times New Roman"/>
+          <w:sz w:val="24"/>
         </w:rPr>
         <w:t xml:space="preserve">        num</w:t>
       </w:r>
@@ -397,11 +416,12 @@
     <w:p>
       <w:pPr>
         <w:spacing w:before="0" w:after="0" w:line="252" w:lineRule="auto"/>
+        <w:jc w:val="left"/>
       </w:pPr>
       <w:r>
         <w:rPr>
-          <w:rFonts w:ascii="Courier New" w:hAnsi="Courier New"/>
-          <w:sz w:val="20"/>
+          <w:rFonts w:ascii="Times New Roman" w:hAnsi="Times New Roman"/>
+          <w:sz w:val="24"/>
         </w:rPr>
         <w:t xml:space="preserve">        for matrix in [matrix_A, matrix_B]</w:t>
       </w:r>
@@ -409,11 +429,12 @@
     <w:p>
       <w:pPr>
         <w:spacing w:before="0" w:after="0" w:line="252" w:lineRule="auto"/>
+        <w:jc w:val="left"/>
       </w:pPr>
       <w:r>
         <w:rPr>
-          <w:rFonts w:ascii="Courier New" w:hAnsi="Courier New"/>
-          <w:sz w:val="20"/>
+          <w:rFonts w:ascii="Times New Roman" w:hAnsi="Times New Roman"/>
+          <w:sz w:val="24"/>
         </w:rPr>
         <w:t xml:space="preserve">        for row in matrix</w:t>
       </w:r>
@@ -421,11 +442,12 @@
     <w:p>
       <w:pPr>
         <w:spacing w:before="0" w:after="0" w:line="252" w:lineRule="auto"/>
+        <w:jc w:val="left"/>
       </w:pPr>
       <w:r>
         <w:rPr>
-          <w:rFonts w:ascii="Courier New" w:hAnsi="Courier New"/>
-          <w:sz w:val="20"/>
+          <w:rFonts w:ascii="Times New Roman" w:hAnsi="Times New Roman"/>
+          <w:sz w:val="24"/>
         </w:rPr>
         <w:t xml:space="preserve">        for num in row</w:t>
       </w:r>
@@ -433,11 +455,12 @@
     <w:p>
       <w:pPr>
         <w:spacing w:before="0" w:after="0" w:line="252" w:lineRule="auto"/>
+        <w:jc w:val="left"/>
       </w:pPr>
       <w:r>
         <w:rPr>
-          <w:rFonts w:ascii="Courier New" w:hAnsi="Courier New"/>
-          <w:sz w:val="20"/>
+          <w:rFonts w:ascii="Times New Roman" w:hAnsi="Times New Roman"/>
+          <w:sz w:val="24"/>
         </w:rPr>
         <w:t xml:space="preserve">    ]</w:t>
       </w:r>
@@ -463,6 +486,7 @@
     <w:p>
       <w:pPr>
         <w:spacing w:before="0" w:after="40" w:line="264" w:lineRule="auto"/>
+        <w:jc w:val="left"/>
       </w:pPr>
       <w:r>
         <w:rPr>
@@ -475,6 +499,7 @@
     <w:p>
       <w:pPr>
         <w:spacing w:before="0" w:after="40" w:line="264" w:lineRule="auto"/>
+        <w:jc w:val="left"/>
       </w:pPr>
       <w:r>
         <w:rPr>
@@ -487,6 +512,7 @@
     <w:p>
       <w:pPr>
         <w:spacing w:before="0" w:after="40" w:line="264" w:lineRule="auto"/>
+        <w:jc w:val="left"/>
       </w:pPr>
       <w:r>
         <w:rPr>
@@ -499,6 +525,7 @@
     <w:p>
       <w:pPr>
         <w:spacing w:before="0" w:after="40" w:line="264" w:lineRule="auto"/>
+        <w:jc w:val="left"/>
       </w:pPr>
       <w:r>
         <w:rPr>
@@ -511,6 +538,7 @@
     <w:p>
       <w:pPr>
         <w:spacing w:before="0" w:after="40" w:line="264" w:lineRule="auto"/>
+        <w:jc w:val="left"/>
       </w:pPr>
       <w:r>
         <w:rPr>
@@ -523,6 +551,7 @@
     <w:p>
       <w:pPr>
         <w:spacing w:before="0" w:after="40" w:line="264" w:lineRule="auto"/>
+        <w:jc w:val="left"/>
       </w:pPr>
       <w:r>
         <w:rPr>
@@ -535,6 +564,7 @@
     <w:p>
       <w:pPr>
         <w:spacing w:before="0" w:after="40" w:line="264" w:lineRule="auto"/>
+        <w:jc w:val="left"/>
       </w:pPr>
       <w:r>
         <w:rPr>
@@ -547,6 +577,7 @@
     <w:p>
       <w:pPr>
         <w:spacing w:before="0" w:after="40" w:line="264" w:lineRule="auto"/>
+        <w:jc w:val="left"/>
       </w:pPr>
       <w:r>
         <w:rPr>
@@ -559,6 +590,7 @@
     <w:p>
       <w:pPr>
         <w:spacing w:before="0" w:after="40" w:line="264" w:lineRule="auto"/>
+        <w:jc w:val="left"/>
       </w:pPr>
       <w:r>
         <w:rPr>
@@ -571,6 +603,7 @@
     <w:p>
       <w:pPr>
         <w:spacing w:before="0" w:after="40" w:line="264" w:lineRule="auto"/>
+        <w:jc w:val="left"/>
       </w:pPr>
       <w:r>
         <w:rPr>
@@ -583,6 +616,7 @@
     <w:p>
       <w:pPr>
         <w:spacing w:before="0" w:after="40" w:line="264" w:lineRule="auto"/>
+        <w:jc w:val="left"/>
       </w:pPr>
       <w:r>
         <w:rPr>
@@ -595,6 +629,7 @@
     <w:p>
       <w:pPr>
         <w:spacing w:before="0" w:after="40" w:line="264" w:lineRule="auto"/>
+        <w:jc w:val="left"/>
       </w:pPr>
       <w:r>
         <w:rPr>
@@ -607,6 +642,7 @@
     <w:p>
       <w:pPr>
         <w:spacing w:before="0" w:after="40" w:line="264" w:lineRule="auto"/>
+        <w:jc w:val="left"/>
       </w:pPr>
       <w:r>
         <w:rPr>
@@ -619,6 +655,7 @@
     <w:p>
       <w:pPr>
         <w:spacing w:before="0" w:after="40" w:line="264" w:lineRule="auto"/>
+        <w:jc w:val="left"/>
       </w:pPr>
       <w:r>
         <w:rPr>
@@ -631,6 +668,7 @@
     <w:p>
       <w:pPr>
         <w:spacing w:before="0" w:after="40" w:line="264" w:lineRule="auto"/>
+        <w:jc w:val="left"/>
       </w:pPr>
       <w:r>
         <w:rPr>
@@ -643,6 +681,7 @@
     <w:p>
       <w:pPr>
         <w:spacing w:before="0" w:after="40" w:line="264" w:lineRule="auto"/>
+        <w:jc w:val="left"/>
       </w:pPr>
       <w:r>
         <w:rPr>
@@ -655,6 +694,7 @@
     <w:p>
       <w:pPr>
         <w:spacing w:before="0" w:after="40" w:line="264" w:lineRule="auto"/>
+        <w:jc w:val="left"/>
       </w:pPr>
       <w:r>
         <w:rPr>
@@ -667,6 +707,7 @@
     <w:p>
       <w:pPr>
         <w:spacing w:before="0" w:after="40" w:line="264" w:lineRule="auto"/>
+        <w:jc w:val="left"/>
       </w:pPr>
       <w:r>
         <w:rPr>
@@ -679,6 +720,7 @@
     <w:p>
       <w:pPr>
         <w:spacing w:before="0" w:after="40" w:line="264" w:lineRule="auto"/>
+        <w:jc w:val="left"/>
       </w:pPr>
       <w:r>
         <w:rPr>
@@ -691,6 +733,7 @@
     <w:p>
       <w:pPr>
         <w:spacing w:before="0" w:after="40" w:line="264" w:lineRule="auto"/>
+        <w:jc w:val="left"/>
       </w:pPr>
       <w:r>
         <w:rPr>
@@ -703,6 +746,7 @@
     <w:p>
       <w:pPr>
         <w:spacing w:before="0" w:after="40" w:line="264" w:lineRule="auto"/>
+        <w:jc w:val="left"/>
       </w:pPr>
       <w:r>
         <w:rPr>
@@ -715,6 +759,7 @@
     <w:p>
       <w:pPr>
         <w:spacing w:before="0" w:after="40" w:line="264" w:lineRule="auto"/>
+        <w:jc w:val="left"/>
       </w:pPr>
       <w:r>
         <w:rPr>
@@ -727,6 +772,7 @@
     <w:p>
       <w:pPr>
         <w:spacing w:before="0" w:after="40" w:line="264" w:lineRule="auto"/>
+        <w:jc w:val="left"/>
       </w:pPr>
       <w:r>
         <w:rPr>
@@ -739,6 +785,7 @@
     <w:p>
       <w:pPr>
         <w:spacing w:before="0" w:after="40" w:line="264" w:lineRule="auto"/>
+        <w:jc w:val="left"/>
       </w:pPr>
       <w:r>
         <w:rPr>
@@ -751,6 +798,7 @@
     <w:p>
       <w:pPr>
         <w:spacing w:before="0" w:after="40" w:line="264" w:lineRule="auto"/>
+        <w:jc w:val="left"/>
       </w:pPr>
       <w:r>
         <w:rPr>
@@ -763,6 +811,7 @@
     <w:p>
       <w:pPr>
         <w:spacing w:before="0" w:after="40" w:line="264" w:lineRule="auto"/>
+        <w:jc w:val="left"/>
       </w:pPr>
       <w:r>
         <w:rPr>
@@ -775,6 +824,7 @@
     <w:p>
       <w:pPr>
         <w:spacing w:before="0" w:after="40" w:line="264" w:lineRule="auto"/>
+        <w:jc w:val="left"/>
       </w:pPr>
       <w:r>
         <w:rPr>
@@ -792,11 +842,12 @@
     <w:p>
       <w:pPr>
         <w:spacing w:before="0" w:after="0" w:line="252" w:lineRule="auto"/>
+        <w:jc w:val="left"/>
       </w:pPr>
       <w:r>
         <w:rPr>
-          <w:rFonts w:ascii="Courier New" w:hAnsi="Courier New"/>
-          <w:sz w:val="20"/>
+          <w:rFonts w:ascii="Times New Roman" w:hAnsi="Times New Roman"/>
+          <w:sz w:val="24"/>
         </w:rPr>
         <w:t xml:space="preserve">    high = max(elements)</w:t>
       </w:r>
@@ -804,11 +855,12 @@
     <w:p>
       <w:pPr>
         <w:spacing w:before="0" w:after="0" w:line="252" w:lineRule="auto"/>
+        <w:jc w:val="left"/>
       </w:pPr>
       <w:r>
         <w:rPr>
-          <w:rFonts w:ascii="Courier New" w:hAnsi="Courier New"/>
-          <w:sz w:val="20"/>
+          <w:rFonts w:ascii="Times New Roman" w:hAnsi="Times New Roman"/>
+          <w:sz w:val="24"/>
         </w:rPr>
         <w:t xml:space="preserve">    low = min(elements)</w:t>
       </w:r>
@@ -816,11 +868,12 @@
     <w:p>
       <w:pPr>
         <w:spacing w:before="0" w:after="0" w:line="252" w:lineRule="auto"/>
+        <w:jc w:val="left"/>
       </w:pPr>
       <w:r>
         <w:rPr>
-          <w:rFonts w:ascii="Courier New" w:hAnsi="Courier New"/>
-          <w:sz w:val="20"/>
+          <w:rFonts w:ascii="Times New Roman" w:hAnsi="Times New Roman"/>
+          <w:sz w:val="24"/>
         </w:rPr>
         <w:t xml:space="preserve">    return high, low</w:t>
       </w:r>
@@ -828,11 +881,12 @@
     <w:p>
       <w:pPr>
         <w:spacing w:before="0" w:after="0" w:line="252" w:lineRule="auto"/>
+        <w:jc w:val="left"/>
       </w:pPr>
       <w:r>
         <w:rPr>
-          <w:rFonts w:ascii="Courier New" w:hAnsi="Courier New"/>
-          <w:sz w:val="20"/>
+          <w:rFonts w:ascii="Times New Roman" w:hAnsi="Times New Roman"/>
+          <w:sz w:val="24"/>
         </w:rPr>
         <w:t xml:space="preserve"> </w:t>
       </w:r>
@@ -840,11 +894,12 @@
     <w:p>
       <w:pPr>
         <w:spacing w:before="0" w:after="0" w:line="252" w:lineRule="auto"/>
+        <w:jc w:val="left"/>
       </w:pPr>
       <w:r>
         <w:rPr>
-          <w:rFonts w:ascii="Courier New" w:hAnsi="Courier New"/>
-          <w:sz w:val="20"/>
+          <w:rFonts w:ascii="Times New Roman" w:hAnsi="Times New Roman"/>
+          <w:sz w:val="24"/>
         </w:rPr>
         <w:t>def display_matrix(matrix, name):</w:t>
       </w:r>
@@ -852,11 +907,12 @@
     <w:p>
       <w:pPr>
         <w:spacing w:before="0" w:after="0" w:line="252" w:lineRule="auto"/>
+        <w:jc w:val="left"/>
       </w:pPr>
       <w:r>
         <w:rPr>
-          <w:rFonts w:ascii="Courier New" w:hAnsi="Courier New"/>
-          <w:sz w:val="20"/>
+          <w:rFonts w:ascii="Times New Roman" w:hAnsi="Times New Roman"/>
+          <w:sz w:val="24"/>
         </w:rPr>
         <w:t xml:space="preserve">    print(f"\n{name}")</w:t>
       </w:r>
@@ -864,11 +920,12 @@
     <w:p>
       <w:pPr>
         <w:spacing w:before="0" w:after="0" w:line="252" w:lineRule="auto"/>
+        <w:jc w:val="left"/>
       </w:pPr>
       <w:r>
         <w:rPr>
-          <w:rFonts w:ascii="Courier New" w:hAnsi="Courier New"/>
-          <w:sz w:val="20"/>
+          <w:rFonts w:ascii="Times New Roman" w:hAnsi="Times New Roman"/>
+          <w:sz w:val="24"/>
         </w:rPr>
         <w:t xml:space="preserve">    for row in matrix:</w:t>
       </w:r>
@@ -876,11 +933,12 @@
     <w:p>
       <w:pPr>
         <w:spacing w:before="0" w:after="0" w:line="252" w:lineRule="auto"/>
+        <w:jc w:val="left"/>
       </w:pPr>
       <w:r>
         <w:rPr>
-          <w:rFonts w:ascii="Courier New" w:hAnsi="Courier New"/>
-          <w:sz w:val="20"/>
+          <w:rFonts w:ascii="Times New Roman" w:hAnsi="Times New Roman"/>
+          <w:sz w:val="24"/>
         </w:rPr>
         <w:t xml:space="preserve">        print(row)</w:t>
       </w:r>
@@ -888,11 +946,12 @@
     <w:p>
       <w:pPr>
         <w:spacing w:before="0" w:after="0" w:line="252" w:lineRule="auto"/>
+        <w:jc w:val="left"/>
       </w:pPr>
       <w:r>
         <w:rPr>
-          <w:rFonts w:ascii="Courier New" w:hAnsi="Courier New"/>
-          <w:sz w:val="20"/>
+          <w:rFonts w:ascii="Times New Roman" w:hAnsi="Times New Roman"/>
+          <w:sz w:val="24"/>
         </w:rPr>
         <w:t xml:space="preserve"> </w:t>
       </w:r>
@@ -900,11 +959,12 @@
     <w:p>
       <w:pPr>
         <w:spacing w:before="0" w:after="0" w:line="252" w:lineRule="auto"/>
+        <w:jc w:val="left"/>
       </w:pPr>
       <w:r>
         <w:rPr>
-          <w:rFonts w:ascii="Courier New" w:hAnsi="Courier New"/>
-          <w:sz w:val="20"/>
+          <w:rFonts w:ascii="Times New Roman" w:hAnsi="Times New Roman"/>
+          <w:sz w:val="24"/>
         </w:rPr>
         <w:t>rows = int(input("Enter number of rows: "))</w:t>
       </w:r>
@@ -912,11 +972,12 @@
     <w:p>
       <w:pPr>
         <w:spacing w:before="0" w:after="0" w:line="252" w:lineRule="auto"/>
+        <w:jc w:val="left"/>
       </w:pPr>
       <w:r>
         <w:rPr>
-          <w:rFonts w:ascii="Courier New" w:hAnsi="Courier New"/>
-          <w:sz w:val="20"/>
+          <w:rFonts w:ascii="Times New Roman" w:hAnsi="Times New Roman"/>
+          <w:sz w:val="24"/>
         </w:rPr>
         <w:t>cols = int(input("Enter number of columns: "))</w:t>
       </w:r>
@@ -924,11 +985,12 @@
     <w:p>
       <w:pPr>
         <w:spacing w:before="0" w:after="0" w:line="252" w:lineRule="auto"/>
+        <w:jc w:val="left"/>
       </w:pPr>
       <w:r>
         <w:rPr>
-          <w:rFonts w:ascii="Courier New" w:hAnsi="Courier New"/>
-          <w:sz w:val="20"/>
+          <w:rFonts w:ascii="Times New Roman" w:hAnsi="Times New Roman"/>
+          <w:sz w:val="24"/>
         </w:rPr>
         <w:t>matrix_A = get_matrix(rows, cols, "Matrix-A")</w:t>
       </w:r>
@@ -936,11 +998,12 @@
     <w:p>
       <w:pPr>
         <w:spacing w:before="0" w:after="0" w:line="252" w:lineRule="auto"/>
+        <w:jc w:val="left"/>
       </w:pPr>
       <w:r>
         <w:rPr>
-          <w:rFonts w:ascii="Courier New" w:hAnsi="Courier New"/>
-          <w:sz w:val="20"/>
+          <w:rFonts w:ascii="Times New Roman" w:hAnsi="Times New Roman"/>
+          <w:sz w:val="24"/>
         </w:rPr>
         <w:t>matrix_B = get_matrix(rows, cols, "Matrix-B")</w:t>
       </w:r>
@@ -948,11 +1011,12 @@
     <w:p>
       <w:pPr>
         <w:spacing w:before="0" w:after="0" w:line="252" w:lineRule="auto"/>
+        <w:jc w:val="left"/>
       </w:pPr>
       <w:r>
         <w:rPr>
-          <w:rFonts w:ascii="Courier New" w:hAnsi="Courier New"/>
-          <w:sz w:val="20"/>
+          <w:rFonts w:ascii="Times New Roman" w:hAnsi="Times New Roman"/>
+          <w:sz w:val="24"/>
         </w:rPr>
         <w:t>high, low = find_high_low(matrix_A, matrix_B)</w:t>
       </w:r>
@@ -960,11 +1024,12 @@
     <w:p>
       <w:pPr>
         <w:spacing w:before="0" w:after="0" w:line="252" w:lineRule="auto"/>
+        <w:jc w:val="left"/>
       </w:pPr>
       <w:r>
         <w:rPr>
-          <w:rFonts w:ascii="Courier New" w:hAnsi="Courier New"/>
-          <w:sz w:val="20"/>
+          <w:rFonts w:ascii="Times New Roman" w:hAnsi="Times New Roman"/>
+          <w:sz w:val="24"/>
         </w:rPr>
         <w:t>display_matrix(matrix_A, "Matrix-A")</w:t>
       </w:r>
@@ -972,11 +1037,12 @@
     <w:p>
       <w:pPr>
         <w:spacing w:before="0" w:after="0" w:line="252" w:lineRule="auto"/>
+        <w:jc w:val="left"/>
       </w:pPr>
       <w:r>
         <w:rPr>
-          <w:rFonts w:ascii="Courier New" w:hAnsi="Courier New"/>
-          <w:sz w:val="20"/>
+          <w:rFonts w:ascii="Times New Roman" w:hAnsi="Times New Roman"/>
+          <w:sz w:val="24"/>
         </w:rPr>
         <w:t>display_matrix(matrix_B, "Matrix-B")</w:t>
       </w:r>
@@ -984,11 +1050,12 @@
     <w:p>
       <w:pPr>
         <w:spacing w:before="0" w:after="0" w:line="252" w:lineRule="auto"/>
+        <w:jc w:val="left"/>
       </w:pPr>
       <w:r>
         <w:rPr>
-          <w:rFonts w:ascii="Courier New" w:hAnsi="Courier New"/>
-          <w:sz w:val="20"/>
+          <w:rFonts w:ascii="Times New Roman" w:hAnsi="Times New Roman"/>
+          <w:sz w:val="24"/>
         </w:rPr>
         <w:t>print("\nHighest num:", high)</w:t>
       </w:r>
@@ -996,11 +1063,12 @@
     <w:p>
       <w:pPr>
         <w:spacing w:before="0" w:after="0" w:line="252" w:lineRule="auto"/>
+        <w:jc w:val="left"/>
       </w:pPr>
       <w:r>
         <w:rPr>
-          <w:rFonts w:ascii="Courier New" w:hAnsi="Courier New"/>
-          <w:sz w:val="20"/>
+          <w:rFonts w:ascii="Times New Roman" w:hAnsi="Times New Roman"/>
+          <w:sz w:val="24"/>
         </w:rPr>
         <w:t>print("Lowest num:", low)</w:t>
       </w:r>
@@ -1010,17 +1078,22 @@
       <w:tblPr>
         <w:tblW w:type="auto" w:w="0"/>
         <w:jc w:val="right"/>
+        <w:tblLook w:firstColumn="1" w:firstRow="1" w:lastColumn="0" w:lastRow="0" w:noHBand="0" w:noVBand="1" w:val="04A0"/>
         <w:tblLayout w:type="fixed"/>
-        <w:tblLook w:firstColumn="1" w:firstRow="1" w:lastColumn="0" w:lastRow="0" w:noHBand="0" w:noVBand="1" w:val="04A0"/>
       </w:tblPr>
       <w:tblGrid>
-        <w:gridCol w:w="4874"/>
-        <w:gridCol w:w="4874"/>
+        <w:gridCol w:w="3600"/>
+        <w:gridCol w:w="2160"/>
       </w:tblGrid>
       <w:tr>
+        <w:trPr>
+          <w:trHeight w:val="400" w:hRule="atLeast"/>
+        </w:trPr>
         <w:tc>
           <w:tcPr>
-            <w:tcW w:type="dxa" w:w="3600"/>
+            <w:tcW w:type="dxa" w:w="4874"/>
+            <w:tcW w:w="3600" w:type="dxa"/>
+            <w:vAlign w:val="center"/>
             <w:tcBorders>
               <w:top w:val="single" w:sz="6" w:space="0" w:color="000000"/>
               <w:left w:val="single" w:sz="6" w:space="0" w:color="000000"/>
@@ -1044,7 +1117,9 @@
         </w:tc>
         <w:tc>
           <w:tcPr>
-            <w:tcW w:type="dxa" w:w="2160"/>
+            <w:tcW w:type="dxa" w:w="4874"/>
+            <w:tcW w:w="2160" w:type="dxa"/>
+            <w:vAlign w:val="center"/>
             <w:tcBorders>
               <w:top w:val="single" w:sz="6" w:space="0" w:color="000000"/>
               <w:left w:val="single" w:sz="6" w:space="0" w:color="000000"/>
@@ -1060,9 +1135,14 @@
         </w:tc>
       </w:tr>
       <w:tr>
+        <w:trPr>
+          <w:trHeight w:val="400" w:hRule="atLeast"/>
+        </w:trPr>
         <w:tc>
           <w:tcPr>
-            <w:tcW w:type="dxa" w:w="3600"/>
+            <w:tcW w:type="dxa" w:w="4874"/>
+            <w:tcW w:w="3600" w:type="dxa"/>
+            <w:vAlign w:val="center"/>
             <w:tcBorders>
               <w:top w:val="single" w:sz="6" w:space="0" w:color="000000"/>
               <w:left w:val="single" w:sz="6" w:space="0" w:color="000000"/>
@@ -1086,7 +1166,9 @@
         </w:tc>
         <w:tc>
           <w:tcPr>
-            <w:tcW w:type="dxa" w:w="2160"/>
+            <w:tcW w:type="dxa" w:w="4874"/>
+            <w:tcW w:w="2160" w:type="dxa"/>
+            <w:vAlign w:val="center"/>
             <w:tcBorders>
               <w:top w:val="single" w:sz="6" w:space="0" w:color="000000"/>
               <w:left w:val="single" w:sz="6" w:space="0" w:color="000000"/>
@@ -1102,9 +1184,14 @@
         </w:tc>
       </w:tr>
       <w:tr>
+        <w:trPr>
+          <w:trHeight w:val="400" w:hRule="atLeast"/>
+        </w:trPr>
         <w:tc>
           <w:tcPr>
-            <w:tcW w:type="dxa" w:w="3600"/>
+            <w:tcW w:type="dxa" w:w="4874"/>
+            <w:tcW w:w="3600" w:type="dxa"/>
+            <w:vAlign w:val="center"/>
             <w:tcBorders>
               <w:top w:val="single" w:sz="6" w:space="0" w:color="000000"/>
               <w:left w:val="single" w:sz="6" w:space="0" w:color="000000"/>
@@ -1128,7 +1215,9 @@
         </w:tc>
         <w:tc>
           <w:tcPr>
-            <w:tcW w:type="dxa" w:w="2160"/>
+            <w:tcW w:type="dxa" w:w="4874"/>
+            <w:tcW w:w="2160" w:type="dxa"/>
+            <w:vAlign w:val="center"/>
             <w:tcBorders>
               <w:top w:val="single" w:sz="6" w:space="0" w:color="000000"/>
               <w:left w:val="single" w:sz="6" w:space="0" w:color="000000"/>
@@ -1144,9 +1233,14 @@
         </w:tc>
       </w:tr>
       <w:tr>
+        <w:trPr>
+          <w:trHeight w:val="400" w:hRule="atLeast"/>
+        </w:trPr>
         <w:tc>
           <w:tcPr>
-            <w:tcW w:type="dxa" w:w="3600"/>
+            <w:tcW w:type="dxa" w:w="4874"/>
+            <w:tcW w:w="3600" w:type="dxa"/>
+            <w:vAlign w:val="center"/>
             <w:tcBorders>
               <w:top w:val="single" w:sz="6" w:space="0" w:color="000000"/>
               <w:left w:val="single" w:sz="6" w:space="0" w:color="000000"/>
@@ -1170,7 +1264,9 @@
         </w:tc>
         <w:tc>
           <w:tcPr>
-            <w:tcW w:type="dxa" w:w="2160"/>
+            <w:tcW w:type="dxa" w:w="4874"/>
+            <w:tcW w:w="2160" w:type="dxa"/>
+            <w:vAlign w:val="center"/>
             <w:tcBorders>
               <w:top w:val="single" w:sz="6" w:space="0" w:color="000000"/>
               <w:left w:val="single" w:sz="6" w:space="0" w:color="000000"/>
@@ -1207,6 +1303,7 @@
     <w:p>
       <w:pPr>
         <w:spacing w:before="40" w:after="120" w:line="276" w:lineRule="auto"/>
+        <w:jc w:val="both"/>
       </w:pPr>
       <w:r>
         <w:rPr>
@@ -1366,6 +1463,7 @@
     <w:p>
       <w:pPr>
         <w:spacing w:before="40" w:after="120" w:line="276" w:lineRule="auto"/>
+        <w:jc w:val="both"/>
       </w:pPr>
       <w:r>
         <w:rPr>
@@ -1392,6 +1490,7 @@
       <w:pPr>
         <w:spacing w:before="40" w:after="60" w:line="276" w:lineRule="auto"/>
         <w:ind w:left="576"/>
+        <w:jc w:val="both"/>
       </w:pPr>
       <w:r>
         <w:rPr>
@@ -1405,6 +1504,7 @@
       <w:pPr>
         <w:spacing w:before="40" w:after="60" w:line="276" w:lineRule="auto"/>
         <w:ind w:left="576"/>
+        <w:jc w:val="both"/>
       </w:pPr>
       <w:r>
         <w:rPr>
@@ -1418,6 +1518,7 @@
       <w:pPr>
         <w:spacing w:before="40" w:after="60" w:line="276" w:lineRule="auto"/>
         <w:ind w:left="576"/>
+        <w:jc w:val="both"/>
       </w:pPr>
       <w:r>
         <w:rPr>
@@ -1431,6 +1532,7 @@
       <w:pPr>
         <w:spacing w:before="40" w:after="60" w:line="276" w:lineRule="auto"/>
         <w:ind w:left="576"/>
+        <w:jc w:val="both"/>
       </w:pPr>
       <w:r>
         <w:rPr>
@@ -1444,6 +1546,7 @@
       <w:pPr>
         <w:spacing w:before="40" w:after="60" w:line="276" w:lineRule="auto"/>
         <w:ind w:left="576"/>
+        <w:jc w:val="both"/>
       </w:pPr>
       <w:r>
         <w:rPr>
@@ -1457,6 +1560,7 @@
       <w:pPr>
         <w:spacing w:before="40" w:after="60" w:line="276" w:lineRule="auto"/>
         <w:ind w:left="576"/>
+        <w:jc w:val="both"/>
       </w:pPr>
       <w:r>
         <w:rPr>
@@ -1482,11 +1586,12 @@
     <w:p>
       <w:pPr>
         <w:spacing w:before="0" w:after="0" w:line="252" w:lineRule="auto"/>
+        <w:jc w:val="left"/>
       </w:pPr>
       <w:r>
         <w:rPr>
-          <w:rFonts w:ascii="Courier New" w:hAnsi="Courier New"/>
-          <w:sz w:val="20"/>
+          <w:rFonts w:ascii="Times New Roman" w:hAnsi="Times New Roman"/>
+          <w:sz w:val="24"/>
         </w:rPr>
         <w:t>def get_set(name):</w:t>
       </w:r>
@@ -1494,11 +1599,12 @@
     <w:p>
       <w:pPr>
         <w:spacing w:before="0" w:after="0" w:line="252" w:lineRule="auto"/>
+        <w:jc w:val="left"/>
       </w:pPr>
       <w:r>
         <w:rPr>
-          <w:rFonts w:ascii="Courier New" w:hAnsi="Courier New"/>
-          <w:sz w:val="20"/>
+          <w:rFonts w:ascii="Times New Roman" w:hAnsi="Times New Roman"/>
+          <w:sz w:val="24"/>
         </w:rPr>
         <w:t xml:space="preserve">    values = input(f"Enter elements of {name}: ").split()</w:t>
       </w:r>
@@ -1506,11 +1612,12 @@
     <w:p>
       <w:pPr>
         <w:spacing w:before="0" w:after="0" w:line="252" w:lineRule="auto"/>
+        <w:jc w:val="left"/>
       </w:pPr>
       <w:r>
         <w:rPr>
-          <w:rFonts w:ascii="Courier New" w:hAnsi="Courier New"/>
-          <w:sz w:val="20"/>
+          <w:rFonts w:ascii="Times New Roman" w:hAnsi="Times New Roman"/>
+          <w:sz w:val="24"/>
         </w:rPr>
         <w:t xml:space="preserve">    return set(map(int, values))</w:t>
       </w:r>
@@ -1518,11 +1625,12 @@
     <w:p>
       <w:pPr>
         <w:spacing w:before="0" w:after="0" w:line="252" w:lineRule="auto"/>
+        <w:jc w:val="left"/>
       </w:pPr>
       <w:r>
         <w:rPr>
-          <w:rFonts w:ascii="Courier New" w:hAnsi="Courier New"/>
-          <w:sz w:val="20"/>
+          <w:rFonts w:ascii="Times New Roman" w:hAnsi="Times New Roman"/>
+          <w:sz w:val="24"/>
         </w:rPr>
         <w:t xml:space="preserve"> </w:t>
       </w:r>
@@ -1530,11 +1638,12 @@
     <w:p>
       <w:pPr>
         <w:spacing w:before="0" w:after="0" w:line="252" w:lineRule="auto"/>
+        <w:jc w:val="left"/>
       </w:pPr>
       <w:r>
         <w:rPr>
-          <w:rFonts w:ascii="Courier New" w:hAnsi="Courier New"/>
-          <w:sz w:val="20"/>
+          <w:rFonts w:ascii="Times New Roman" w:hAnsi="Times New Roman"/>
+          <w:sz w:val="24"/>
         </w:rPr>
         <w:t>def find_symmetric_difference(set_A, set_B):</w:t>
       </w:r>
@@ -1542,11 +1651,12 @@
     <w:p>
       <w:pPr>
         <w:spacing w:before="0" w:after="0" w:line="252" w:lineRule="auto"/>
+        <w:jc w:val="left"/>
       </w:pPr>
       <w:r>
         <w:rPr>
-          <w:rFonts w:ascii="Courier New" w:hAnsi="Courier New"/>
-          <w:sz w:val="20"/>
+          <w:rFonts w:ascii="Times New Roman" w:hAnsi="Times New Roman"/>
+          <w:sz w:val="24"/>
         </w:rPr>
         <w:t xml:space="preserve">    sym_diff_set = {</w:t>
       </w:r>
@@ -1554,11 +1664,12 @@
     <w:p>
       <w:pPr>
         <w:spacing w:before="0" w:after="0" w:line="252" w:lineRule="auto"/>
+        <w:jc w:val="left"/>
       </w:pPr>
       <w:r>
         <w:rPr>
-          <w:rFonts w:ascii="Courier New" w:hAnsi="Courier New"/>
-          <w:sz w:val="20"/>
+          <w:rFonts w:ascii="Times New Roman" w:hAnsi="Times New Roman"/>
+          <w:sz w:val="24"/>
         </w:rPr>
         <w:t xml:space="preserve">        item</w:t>
       </w:r>
@@ -1566,11 +1677,12 @@
     <w:p>
       <w:pPr>
         <w:spacing w:before="0" w:after="0" w:line="252" w:lineRule="auto"/>
+        <w:jc w:val="left"/>
       </w:pPr>
       <w:r>
         <w:rPr>
-          <w:rFonts w:ascii="Courier New" w:hAnsi="Courier New"/>
-          <w:sz w:val="20"/>
+          <w:rFonts w:ascii="Times New Roman" w:hAnsi="Times New Roman"/>
+          <w:sz w:val="24"/>
         </w:rPr>
         <w:t xml:space="preserve">        for item in set_A.union(set_B)</w:t>
       </w:r>
@@ -1578,11 +1690,12 @@
     <w:p>
       <w:pPr>
         <w:spacing w:before="0" w:after="0" w:line="252" w:lineRule="auto"/>
+        <w:jc w:val="left"/>
       </w:pPr>
       <w:r>
         <w:rPr>
-          <w:rFonts w:ascii="Courier New" w:hAnsi="Courier New"/>
-          <w:sz w:val="20"/>
+          <w:rFonts w:ascii="Times New Roman" w:hAnsi="Times New Roman"/>
+          <w:sz w:val="24"/>
         </w:rPr>
         <w:t xml:space="preserve">        if item not in set_A.intersection(set_B)</w:t>
       </w:r>
@@ -1590,11 +1703,12 @@
     <w:p>
       <w:pPr>
         <w:spacing w:before="0" w:after="0" w:line="252" w:lineRule="auto"/>
+        <w:jc w:val="left"/>
       </w:pPr>
       <w:r>
         <w:rPr>
-          <w:rFonts w:ascii="Courier New" w:hAnsi="Courier New"/>
-          <w:sz w:val="20"/>
+          <w:rFonts w:ascii="Times New Roman" w:hAnsi="Times New Roman"/>
+          <w:sz w:val="24"/>
         </w:rPr>
         <w:t xml:space="preserve">    }</w:t>
       </w:r>
@@ -1602,11 +1716,12 @@
     <w:p>
       <w:pPr>
         <w:spacing w:before="0" w:after="0" w:line="252" w:lineRule="auto"/>
+        <w:jc w:val="left"/>
       </w:pPr>
       <w:r>
         <w:rPr>
-          <w:rFonts w:ascii="Courier New" w:hAnsi="Courier New"/>
-          <w:sz w:val="20"/>
+          <w:rFonts w:ascii="Times New Roman" w:hAnsi="Times New Roman"/>
+          <w:sz w:val="24"/>
         </w:rPr>
         <w:t xml:space="preserve">    return sym_diff_set</w:t>
       </w:r>
@@ -1614,11 +1729,12 @@
     <w:p>
       <w:pPr>
         <w:spacing w:before="0" w:after="0" w:line="252" w:lineRule="auto"/>
+        <w:jc w:val="left"/>
       </w:pPr>
       <w:r>
         <w:rPr>
-          <w:rFonts w:ascii="Courier New" w:hAnsi="Courier New"/>
-          <w:sz w:val="20"/>
+          <w:rFonts w:ascii="Times New Roman" w:hAnsi="Times New Roman"/>
+          <w:sz w:val="24"/>
         </w:rPr>
         <w:t xml:space="preserve"> </w:t>
       </w:r>
@@ -1626,11 +1742,12 @@
     <w:p>
       <w:pPr>
         <w:spacing w:before="0" w:after="0" w:line="252" w:lineRule="auto"/>
+        <w:jc w:val="left"/>
       </w:pPr>
       <w:r>
         <w:rPr>
-          <w:rFonts w:ascii="Courier New" w:hAnsi="Courier New"/>
-          <w:sz w:val="20"/>
+          <w:rFonts w:ascii="Times New Roman" w:hAnsi="Times New Roman"/>
+          <w:sz w:val="24"/>
         </w:rPr>
         <w:t>def display_result(set_A, set_B, sym_diff_set):</w:t>
       </w:r>
@@ -1638,11 +1755,12 @@
     <w:p>
       <w:pPr>
         <w:spacing w:before="0" w:after="0" w:line="252" w:lineRule="auto"/>
+        <w:jc w:val="left"/>
       </w:pPr>
       <w:r>
         <w:rPr>
-          <w:rFonts w:ascii="Courier New" w:hAnsi="Courier New"/>
-          <w:sz w:val="20"/>
+          <w:rFonts w:ascii="Times New Roman" w:hAnsi="Times New Roman"/>
+          <w:sz w:val="24"/>
         </w:rPr>
         <w:t xml:space="preserve">    print("\nSet-A:", set_A)</w:t>
       </w:r>
@@ -1668,6 +1786,7 @@
     <w:p>
       <w:pPr>
         <w:spacing w:before="0" w:after="40" w:line="264" w:lineRule="auto"/>
+        <w:jc w:val="left"/>
       </w:pPr>
       <w:r>
         <w:rPr>
@@ -1680,6 +1799,7 @@
     <w:p>
       <w:pPr>
         <w:spacing w:before="0" w:after="40" w:line="264" w:lineRule="auto"/>
+        <w:jc w:val="left"/>
       </w:pPr>
       <w:r>
         <w:rPr>
@@ -1692,6 +1812,7 @@
     <w:p>
       <w:pPr>
         <w:spacing w:before="0" w:after="40" w:line="264" w:lineRule="auto"/>
+        <w:jc w:val="left"/>
       </w:pPr>
       <w:r>
         <w:rPr>
@@ -1704,6 +1825,7 @@
     <w:p>
       <w:pPr>
         <w:spacing w:before="0" w:after="40" w:line="264" w:lineRule="auto"/>
+        <w:jc w:val="left"/>
       </w:pPr>
       <w:r>
         <w:rPr>
@@ -1716,6 +1838,7 @@
     <w:p>
       <w:pPr>
         <w:spacing w:before="0" w:after="40" w:line="264" w:lineRule="auto"/>
+        <w:jc w:val="left"/>
       </w:pPr>
       <w:r>
         <w:rPr>
@@ -1728,6 +1851,7 @@
     <w:p>
       <w:pPr>
         <w:spacing w:before="0" w:after="40" w:line="264" w:lineRule="auto"/>
+        <w:jc w:val="left"/>
       </w:pPr>
       <w:r>
         <w:rPr>
@@ -1740,6 +1864,7 @@
     <w:p>
       <w:pPr>
         <w:spacing w:before="0" w:after="40" w:line="264" w:lineRule="auto"/>
+        <w:jc w:val="left"/>
       </w:pPr>
       <w:r>
         <w:rPr>
@@ -1752,6 +1877,7 @@
     <w:p>
       <w:pPr>
         <w:spacing w:before="0" w:after="40" w:line="264" w:lineRule="auto"/>
+        <w:jc w:val="left"/>
       </w:pPr>
       <w:r>
         <w:rPr>
@@ -1769,11 +1895,12 @@
     <w:p>
       <w:pPr>
         <w:spacing w:before="0" w:after="0" w:line="252" w:lineRule="auto"/>
+        <w:jc w:val="left"/>
       </w:pPr>
       <w:r>
         <w:rPr>
-          <w:rFonts w:ascii="Courier New" w:hAnsi="Courier New"/>
-          <w:sz w:val="20"/>
+          <w:rFonts w:ascii="Times New Roman" w:hAnsi="Times New Roman"/>
+          <w:sz w:val="24"/>
         </w:rPr>
         <w:t xml:space="preserve">    print("Set-B:", set_B)</w:t>
       </w:r>
@@ -1781,11 +1908,12 @@
     <w:p>
       <w:pPr>
         <w:spacing w:before="0" w:after="0" w:line="252" w:lineRule="auto"/>
+        <w:jc w:val="left"/>
       </w:pPr>
       <w:r>
         <w:rPr>
-          <w:rFonts w:ascii="Courier New" w:hAnsi="Courier New"/>
-          <w:sz w:val="20"/>
+          <w:rFonts w:ascii="Times New Roman" w:hAnsi="Times New Roman"/>
+          <w:sz w:val="24"/>
         </w:rPr>
         <w:t xml:space="preserve">    print("Symmetric difference:", sym_diff_set)</w:t>
       </w:r>
@@ -1793,11 +1921,12 @@
     <w:p>
       <w:pPr>
         <w:spacing w:before="0" w:after="0" w:line="252" w:lineRule="auto"/>
+        <w:jc w:val="left"/>
       </w:pPr>
       <w:r>
         <w:rPr>
-          <w:rFonts w:ascii="Courier New" w:hAnsi="Courier New"/>
-          <w:sz w:val="20"/>
+          <w:rFonts w:ascii="Times New Roman" w:hAnsi="Times New Roman"/>
+          <w:sz w:val="24"/>
         </w:rPr>
         <w:t xml:space="preserve">    print("Length of symmetric difference:", len(sym_diff_set))</w:t>
       </w:r>
@@ -1805,11 +1934,12 @@
     <w:p>
       <w:pPr>
         <w:spacing w:before="0" w:after="0" w:line="252" w:lineRule="auto"/>
+        <w:jc w:val="left"/>
       </w:pPr>
       <w:r>
         <w:rPr>
-          <w:rFonts w:ascii="Courier New" w:hAnsi="Courier New"/>
-          <w:sz w:val="20"/>
+          <w:rFonts w:ascii="Times New Roman" w:hAnsi="Times New Roman"/>
+          <w:sz w:val="24"/>
         </w:rPr>
         <w:t xml:space="preserve"> </w:t>
       </w:r>
@@ -1817,11 +1947,12 @@
     <w:p>
       <w:pPr>
         <w:spacing w:before="0" w:after="0" w:line="252" w:lineRule="auto"/>
+        <w:jc w:val="left"/>
       </w:pPr>
       <w:r>
         <w:rPr>
-          <w:rFonts w:ascii="Courier New" w:hAnsi="Courier New"/>
-          <w:sz w:val="20"/>
+          <w:rFonts w:ascii="Times New Roman" w:hAnsi="Times New Roman"/>
+          <w:sz w:val="24"/>
         </w:rPr>
         <w:t>set_A = get_set("Set-A")</w:t>
       </w:r>
@@ -1829,11 +1960,12 @@
     <w:p>
       <w:pPr>
         <w:spacing w:before="0" w:after="0" w:line="252" w:lineRule="auto"/>
+        <w:jc w:val="left"/>
       </w:pPr>
       <w:r>
         <w:rPr>
-          <w:rFonts w:ascii="Courier New" w:hAnsi="Courier New"/>
-          <w:sz w:val="20"/>
+          <w:rFonts w:ascii="Times New Roman" w:hAnsi="Times New Roman"/>
+          <w:sz w:val="24"/>
         </w:rPr>
         <w:t>set_B = get_set("Set-B")</w:t>
       </w:r>
@@ -1841,11 +1973,12 @@
     <w:p>
       <w:pPr>
         <w:spacing w:before="0" w:after="0" w:line="252" w:lineRule="auto"/>
+        <w:jc w:val="left"/>
       </w:pPr>
       <w:r>
         <w:rPr>
-          <w:rFonts w:ascii="Courier New" w:hAnsi="Courier New"/>
-          <w:sz w:val="20"/>
+          <w:rFonts w:ascii="Times New Roman" w:hAnsi="Times New Roman"/>
+          <w:sz w:val="24"/>
         </w:rPr>
         <w:t>sym_diff_set = find_symmetric_difference(set_A, set_B)</w:t>
       </w:r>
@@ -1853,11 +1986,12 @@
     <w:p>
       <w:pPr>
         <w:spacing w:before="0" w:after="0" w:line="252" w:lineRule="auto"/>
+        <w:jc w:val="left"/>
       </w:pPr>
       <w:r>
         <w:rPr>
-          <w:rFonts w:ascii="Courier New" w:hAnsi="Courier New"/>
-          <w:sz w:val="20"/>
+          <w:rFonts w:ascii="Times New Roman" w:hAnsi="Times New Roman"/>
+          <w:sz w:val="24"/>
         </w:rPr>
         <w:t>display_result(set_A, set_B, sym_diff_set)</w:t>
       </w:r>
@@ -1867,17 +2001,22 @@
       <w:tblPr>
         <w:tblW w:type="auto" w:w="0"/>
         <w:jc w:val="right"/>
+        <w:tblLook w:firstColumn="1" w:firstRow="1" w:lastColumn="0" w:lastRow="0" w:noHBand="0" w:noVBand="1" w:val="04A0"/>
         <w:tblLayout w:type="fixed"/>
-        <w:tblLook w:firstColumn="1" w:firstRow="1" w:lastColumn="0" w:lastRow="0" w:noHBand="0" w:noVBand="1" w:val="04A0"/>
       </w:tblPr>
       <w:tblGrid>
-        <w:gridCol w:w="4874"/>
-        <w:gridCol w:w="4874"/>
+        <w:gridCol w:w="3600"/>
+        <w:gridCol w:w="2160"/>
       </w:tblGrid>
       <w:tr>
+        <w:trPr>
+          <w:trHeight w:val="400" w:hRule="atLeast"/>
+        </w:trPr>
         <w:tc>
           <w:tcPr>
-            <w:tcW w:type="dxa" w:w="3600"/>
+            <w:tcW w:type="dxa" w:w="4874"/>
+            <w:tcW w:w="3600" w:type="dxa"/>
+            <w:vAlign w:val="center"/>
             <w:tcBorders>
               <w:top w:val="single" w:sz="6" w:space="0" w:color="000000"/>
               <w:left w:val="single" w:sz="6" w:space="0" w:color="000000"/>
@@ -1901,7 +2040,9 @@
         </w:tc>
         <w:tc>
           <w:tcPr>
-            <w:tcW w:type="dxa" w:w="2160"/>
+            <w:tcW w:type="dxa" w:w="4874"/>
+            <w:tcW w:w="2160" w:type="dxa"/>
+            <w:vAlign w:val="center"/>
             <w:tcBorders>
               <w:top w:val="single" w:sz="6" w:space="0" w:color="000000"/>
               <w:left w:val="single" w:sz="6" w:space="0" w:color="000000"/>
@@ -1917,9 +2058,14 @@
         </w:tc>
       </w:tr>
       <w:tr>
+        <w:trPr>
+          <w:trHeight w:val="400" w:hRule="atLeast"/>
+        </w:trPr>
         <w:tc>
           <w:tcPr>
-            <w:tcW w:type="dxa" w:w="3600"/>
+            <w:tcW w:type="dxa" w:w="4874"/>
+            <w:tcW w:w="3600" w:type="dxa"/>
+            <w:vAlign w:val="center"/>
             <w:tcBorders>
               <w:top w:val="single" w:sz="6" w:space="0" w:color="000000"/>
               <w:left w:val="single" w:sz="6" w:space="0" w:color="000000"/>
@@ -1943,7 +2089,9 @@
         </w:tc>
         <w:tc>
           <w:tcPr>
-            <w:tcW w:type="dxa" w:w="2160"/>
+            <w:tcW w:type="dxa" w:w="4874"/>
+            <w:tcW w:w="2160" w:type="dxa"/>
+            <w:vAlign w:val="center"/>
             <w:tcBorders>
               <w:top w:val="single" w:sz="6" w:space="0" w:color="000000"/>
               <w:left w:val="single" w:sz="6" w:space="0" w:color="000000"/>
@@ -1959,9 +2107,14 @@
         </w:tc>
       </w:tr>
       <w:tr>
+        <w:trPr>
+          <w:trHeight w:val="400" w:hRule="atLeast"/>
+        </w:trPr>
         <w:tc>
           <w:tcPr>
-            <w:tcW w:type="dxa" w:w="3600"/>
+            <w:tcW w:type="dxa" w:w="4874"/>
+            <w:tcW w:w="3600" w:type="dxa"/>
+            <w:vAlign w:val="center"/>
             <w:tcBorders>
               <w:top w:val="single" w:sz="6" w:space="0" w:color="000000"/>
               <w:left w:val="single" w:sz="6" w:space="0" w:color="000000"/>
@@ -1985,7 +2138,9 @@
         </w:tc>
         <w:tc>
           <w:tcPr>
-            <w:tcW w:type="dxa" w:w="2160"/>
+            <w:tcW w:type="dxa" w:w="4874"/>
+            <w:tcW w:w="2160" w:type="dxa"/>
+            <w:vAlign w:val="center"/>
             <w:tcBorders>
               <w:top w:val="single" w:sz="6" w:space="0" w:color="000000"/>
               <w:left w:val="single" w:sz="6" w:space="0" w:color="000000"/>
@@ -2001,9 +2156,14 @@
         </w:tc>
       </w:tr>
       <w:tr>
+        <w:trPr>
+          <w:trHeight w:val="400" w:hRule="atLeast"/>
+        </w:trPr>
         <w:tc>
           <w:tcPr>
-            <w:tcW w:type="dxa" w:w="3600"/>
+            <w:tcW w:type="dxa" w:w="4874"/>
+            <w:tcW w:w="3600" w:type="dxa"/>
+            <w:vAlign w:val="center"/>
             <w:tcBorders>
               <w:top w:val="single" w:sz="6" w:space="0" w:color="000000"/>
               <w:left w:val="single" w:sz="6" w:space="0" w:color="000000"/>
@@ -2027,7 +2187,9 @@
         </w:tc>
         <w:tc>
           <w:tcPr>
-            <w:tcW w:type="dxa" w:w="2160"/>
+            <w:tcW w:type="dxa" w:w="4874"/>
+            <w:tcW w:w="2160" w:type="dxa"/>
+            <w:vAlign w:val="center"/>
             <w:tcBorders>
               <w:top w:val="single" w:sz="6" w:space="0" w:color="000000"/>
               <w:left w:val="single" w:sz="6" w:space="0" w:color="000000"/>
@@ -2064,6 +2226,7 @@
     <w:p>
       <w:pPr>
         <w:spacing w:before="40" w:after="120" w:line="276" w:lineRule="auto"/>
+        <w:jc w:val="both"/>
       </w:pPr>
       <w:r>
         <w:rPr>
@@ -2223,6 +2386,7 @@
     <w:p>
       <w:pPr>
         <w:spacing w:before="40" w:after="120" w:line="276" w:lineRule="auto"/>
+        <w:jc w:val="both"/>
       </w:pPr>
       <w:r>
         <w:rPr>
@@ -2249,6 +2413,7 @@
       <w:pPr>
         <w:spacing w:before="40" w:after="60" w:line="276" w:lineRule="auto"/>
         <w:ind w:left="576"/>
+        <w:jc w:val="both"/>
       </w:pPr>
       <w:r>
         <w:rPr>
@@ -2262,6 +2427,7 @@
       <w:pPr>
         <w:spacing w:before="40" w:after="60" w:line="276" w:lineRule="auto"/>
         <w:ind w:left="576"/>
+        <w:jc w:val="both"/>
       </w:pPr>
       <w:r>
         <w:rPr>
@@ -2275,6 +2441,7 @@
       <w:pPr>
         <w:spacing w:before="40" w:after="60" w:line="276" w:lineRule="auto"/>
         <w:ind w:left="576"/>
+        <w:jc w:val="both"/>
       </w:pPr>
       <w:r>
         <w:rPr>
@@ -2288,6 +2455,7 @@
       <w:pPr>
         <w:spacing w:before="40" w:after="60" w:line="276" w:lineRule="auto"/>
         <w:ind w:left="576"/>
+        <w:jc w:val="both"/>
       </w:pPr>
       <w:r>
         <w:rPr>
@@ -2301,6 +2469,7 @@
       <w:pPr>
         <w:spacing w:before="40" w:after="60" w:line="276" w:lineRule="auto"/>
         <w:ind w:left="576"/>
+        <w:jc w:val="both"/>
       </w:pPr>
       <w:r>
         <w:rPr>
@@ -2326,11 +2495,12 @@
     <w:p>
       <w:pPr>
         <w:spacing w:before="0" w:after="0" w:line="252" w:lineRule="auto"/>
+        <w:jc w:val="left"/>
       </w:pPr>
       <w:r>
         <w:rPr>
-          <w:rFonts w:ascii="Courier New" w:hAnsi="Courier New"/>
-          <w:sz w:val="20"/>
+          <w:rFonts w:ascii="Times New Roman" w:hAnsi="Times New Roman"/>
+          <w:sz w:val="24"/>
         </w:rPr>
         <w:t>def get_input():</w:t>
       </w:r>
@@ -2338,11 +2508,12 @@
     <w:p>
       <w:pPr>
         <w:spacing w:before="0" w:after="0" w:line="252" w:lineRule="auto"/>
+        <w:jc w:val="left"/>
       </w:pPr>
       <w:r>
         <w:rPr>
-          <w:rFonts w:ascii="Courier New" w:hAnsi="Courier New"/>
-          <w:sz w:val="20"/>
+          <w:rFonts w:ascii="Times New Roman" w:hAnsi="Times New Roman"/>
+          <w:sz w:val="24"/>
         </w:rPr>
         <w:t xml:space="preserve">    letters = input("Enter letters separated by space: ").split()</w:t>
       </w:r>
@@ -2350,11 +2521,12 @@
     <w:p>
       <w:pPr>
         <w:spacing w:before="0" w:after="0" w:line="252" w:lineRule="auto"/>
+        <w:jc w:val="left"/>
       </w:pPr>
       <w:r>
         <w:rPr>
-          <w:rFonts w:ascii="Courier New" w:hAnsi="Courier New"/>
-          <w:sz w:val="20"/>
+          <w:rFonts w:ascii="Times New Roman" w:hAnsi="Times New Roman"/>
+          <w:sz w:val="24"/>
         </w:rPr>
         <w:t xml:space="preserve">    digits = list(map(int, input("Enter digits separated by space: ").split()))</w:t>
       </w:r>
@@ -2362,11 +2534,12 @@
     <w:p>
       <w:pPr>
         <w:spacing w:before="0" w:after="0" w:line="252" w:lineRule="auto"/>
+        <w:jc w:val="left"/>
       </w:pPr>
       <w:r>
         <w:rPr>
-          <w:rFonts w:ascii="Courier New" w:hAnsi="Courier New"/>
-          <w:sz w:val="20"/>
+          <w:rFonts w:ascii="Times New Roman" w:hAnsi="Times New Roman"/>
+          <w:sz w:val="24"/>
         </w:rPr>
         <w:t xml:space="preserve">    words = input("Enter words separated by space: ").split()</w:t>
       </w:r>
@@ -2374,11 +2547,12 @@
     <w:p>
       <w:pPr>
         <w:spacing w:before="0" w:after="0" w:line="252" w:lineRule="auto"/>
+        <w:jc w:val="left"/>
       </w:pPr>
       <w:r>
         <w:rPr>
-          <w:rFonts w:ascii="Courier New" w:hAnsi="Courier New"/>
-          <w:sz w:val="20"/>
+          <w:rFonts w:ascii="Times New Roman" w:hAnsi="Times New Roman"/>
+          <w:sz w:val="24"/>
         </w:rPr>
         <w:t xml:space="preserve">    return letters, digits, words</w:t>
       </w:r>
@@ -2386,11 +2560,12 @@
     <w:p>
       <w:pPr>
         <w:spacing w:before="0" w:after="0" w:line="252" w:lineRule="auto"/>
+        <w:jc w:val="left"/>
       </w:pPr>
       <w:r>
         <w:rPr>
-          <w:rFonts w:ascii="Courier New" w:hAnsi="Courier New"/>
-          <w:sz w:val="20"/>
+          <w:rFonts w:ascii="Times New Roman" w:hAnsi="Times New Roman"/>
+          <w:sz w:val="24"/>
         </w:rPr>
         <w:t xml:space="preserve"> </w:t>
       </w:r>
@@ -2398,11 +2573,12 @@
     <w:p>
       <w:pPr>
         <w:spacing w:before="0" w:after="0" w:line="252" w:lineRule="auto"/>
+        <w:jc w:val="left"/>
       </w:pPr>
       <w:r>
         <w:rPr>
-          <w:rFonts w:ascii="Courier New" w:hAnsi="Courier New"/>
-          <w:sz w:val="20"/>
+          <w:rFonts w:ascii="Times New Roman" w:hAnsi="Times New Roman"/>
+          <w:sz w:val="24"/>
         </w:rPr>
         <w:t>def create_dictionary(letters, digits, words):</w:t>
       </w:r>
@@ -2410,11 +2586,12 @@
     <w:p>
       <w:pPr>
         <w:spacing w:before="0" w:after="0" w:line="252" w:lineRule="auto"/>
+        <w:jc w:val="left"/>
       </w:pPr>
       <w:r>
         <w:rPr>
-          <w:rFonts w:ascii="Courier New" w:hAnsi="Courier New"/>
-          <w:sz w:val="20"/>
+          <w:rFonts w:ascii="Times New Roman" w:hAnsi="Times New Roman"/>
+          <w:sz w:val="24"/>
         </w:rPr>
         <w:t xml:space="preserve">    dictionary = {</w:t>
       </w:r>
@@ -2422,11 +2599,12 @@
     <w:p>
       <w:pPr>
         <w:spacing w:before="0" w:after="0" w:line="252" w:lineRule="auto"/>
+        <w:jc w:val="left"/>
       </w:pPr>
       <w:r>
         <w:rPr>
-          <w:rFonts w:ascii="Courier New" w:hAnsi="Courier New"/>
-          <w:sz w:val="20"/>
+          <w:rFonts w:ascii="Times New Roman" w:hAnsi="Times New Roman"/>
+          <w:sz w:val="24"/>
         </w:rPr>
         <w:t xml:space="preserve">        letter: {</w:t>
       </w:r>
@@ -2434,11 +2612,12 @@
     <w:p>
       <w:pPr>
         <w:spacing w:before="0" w:after="0" w:line="252" w:lineRule="auto"/>
+        <w:jc w:val="left"/>
       </w:pPr>
       <w:r>
         <w:rPr>
-          <w:rFonts w:ascii="Courier New" w:hAnsi="Courier New"/>
-          <w:sz w:val="20"/>
+          <w:rFonts w:ascii="Times New Roman" w:hAnsi="Times New Roman"/>
+          <w:sz w:val="24"/>
         </w:rPr>
         <w:t xml:space="preserve">            "digit": digits[i],</w:t>
       </w:r>
@@ -2446,11 +2625,12 @@
     <w:p>
       <w:pPr>
         <w:spacing w:before="0" w:after="0" w:line="252" w:lineRule="auto"/>
+        <w:jc w:val="left"/>
       </w:pPr>
       <w:r>
         <w:rPr>
-          <w:rFonts w:ascii="Courier New" w:hAnsi="Courier New"/>
-          <w:sz w:val="20"/>
+          <w:rFonts w:ascii="Times New Roman" w:hAnsi="Times New Roman"/>
+          <w:sz w:val="24"/>
         </w:rPr>
         <w:t xml:space="preserve">            "word": words[i]</w:t>
       </w:r>
@@ -2458,11 +2638,12 @@
     <w:p>
       <w:pPr>
         <w:spacing w:before="0" w:after="0" w:line="252" w:lineRule="auto"/>
+        <w:jc w:val="left"/>
       </w:pPr>
       <w:r>
         <w:rPr>
-          <w:rFonts w:ascii="Courier New" w:hAnsi="Courier New"/>
-          <w:sz w:val="20"/>
+          <w:rFonts w:ascii="Times New Roman" w:hAnsi="Times New Roman"/>
+          <w:sz w:val="24"/>
         </w:rPr>
         <w:t xml:space="preserve">        }</w:t>
       </w:r>
@@ -2470,11 +2651,12 @@
     <w:p>
       <w:pPr>
         <w:spacing w:before="0" w:after="0" w:line="252" w:lineRule="auto"/>
+        <w:jc w:val="left"/>
       </w:pPr>
       <w:r>
         <w:rPr>
-          <w:rFonts w:ascii="Courier New" w:hAnsi="Courier New"/>
-          <w:sz w:val="20"/>
+          <w:rFonts w:ascii="Times New Roman" w:hAnsi="Times New Roman"/>
+          <w:sz w:val="24"/>
         </w:rPr>
         <w:t xml:space="preserve">        for i, letter in enumerate(letters)</w:t>
       </w:r>
@@ -2482,11 +2664,12 @@
     <w:p>
       <w:pPr>
         <w:spacing w:before="0" w:after="0" w:line="252" w:lineRule="auto"/>
+        <w:jc w:val="left"/>
       </w:pPr>
       <w:r>
         <w:rPr>
-          <w:rFonts w:ascii="Courier New" w:hAnsi="Courier New"/>
-          <w:sz w:val="20"/>
+          <w:rFonts w:ascii="Times New Roman" w:hAnsi="Times New Roman"/>
+          <w:sz w:val="24"/>
         </w:rPr>
         <w:t xml:space="preserve">    }</w:t>
       </w:r>
@@ -2512,6 +2695,7 @@
     <w:p>
       <w:pPr>
         <w:spacing w:before="0" w:after="40" w:line="264" w:lineRule="auto"/>
+        <w:jc w:val="left"/>
       </w:pPr>
       <w:r>
         <w:rPr>
@@ -2524,6 +2708,7 @@
     <w:p>
       <w:pPr>
         <w:spacing w:before="0" w:after="40" w:line="264" w:lineRule="auto"/>
+        <w:jc w:val="left"/>
       </w:pPr>
       <w:r>
         <w:rPr>
@@ -2536,6 +2721,7 @@
     <w:p>
       <w:pPr>
         <w:spacing w:before="0" w:after="40" w:line="264" w:lineRule="auto"/>
+        <w:jc w:val="left"/>
       </w:pPr>
       <w:r>
         <w:rPr>
@@ -2548,6 +2734,7 @@
     <w:p>
       <w:pPr>
         <w:spacing w:before="0" w:after="40" w:line="264" w:lineRule="auto"/>
+        <w:jc w:val="left"/>
       </w:pPr>
       <w:r>
         <w:rPr>
@@ -2560,6 +2747,7 @@
     <w:p>
       <w:pPr>
         <w:spacing w:before="0" w:after="40" w:line="264" w:lineRule="auto"/>
+        <w:jc w:val="left"/>
       </w:pPr>
       <w:r>
         <w:rPr>
@@ -2572,6 +2760,7 @@
     <w:p>
       <w:pPr>
         <w:spacing w:before="0" w:after="40" w:line="264" w:lineRule="auto"/>
+        <w:jc w:val="left"/>
       </w:pPr>
       <w:r>
         <w:rPr>
@@ -2584,6 +2773,7 @@
     <w:p>
       <w:pPr>
         <w:spacing w:before="0" w:after="40" w:line="264" w:lineRule="auto"/>
+        <w:jc w:val="left"/>
       </w:pPr>
       <w:r>
         <w:rPr>
@@ -2601,11 +2791,12 @@
     <w:p>
       <w:pPr>
         <w:spacing w:before="0" w:after="0" w:line="252" w:lineRule="auto"/>
+        <w:jc w:val="left"/>
       </w:pPr>
       <w:r>
         <w:rPr>
-          <w:rFonts w:ascii="Courier New" w:hAnsi="Courier New"/>
-          <w:sz w:val="20"/>
+          <w:rFonts w:ascii="Times New Roman" w:hAnsi="Times New Roman"/>
+          <w:sz w:val="24"/>
         </w:rPr>
         <w:t xml:space="preserve">    return dictionary</w:t>
       </w:r>
@@ -2613,11 +2804,12 @@
     <w:p>
       <w:pPr>
         <w:spacing w:before="0" w:after="0" w:line="252" w:lineRule="auto"/>
+        <w:jc w:val="left"/>
       </w:pPr>
       <w:r>
         <w:rPr>
-          <w:rFonts w:ascii="Courier New" w:hAnsi="Courier New"/>
-          <w:sz w:val="20"/>
+          <w:rFonts w:ascii="Times New Roman" w:hAnsi="Times New Roman"/>
+          <w:sz w:val="24"/>
         </w:rPr>
         <w:t xml:space="preserve"> </w:t>
       </w:r>
@@ -2625,11 +2817,12 @@
     <w:p>
       <w:pPr>
         <w:spacing w:before="0" w:after="0" w:line="252" w:lineRule="auto"/>
+        <w:jc w:val="left"/>
       </w:pPr>
       <w:r>
         <w:rPr>
-          <w:rFonts w:ascii="Courier New" w:hAnsi="Courier New"/>
-          <w:sz w:val="20"/>
+          <w:rFonts w:ascii="Times New Roman" w:hAnsi="Times New Roman"/>
+          <w:sz w:val="24"/>
         </w:rPr>
         <w:t>def display_dictionary(dictionary):</w:t>
       </w:r>
@@ -2637,11 +2830,12 @@
     <w:p>
       <w:pPr>
         <w:spacing w:before="0" w:after="0" w:line="252" w:lineRule="auto"/>
+        <w:jc w:val="left"/>
       </w:pPr>
       <w:r>
         <w:rPr>
-          <w:rFonts w:ascii="Courier New" w:hAnsi="Courier New"/>
-          <w:sz w:val="20"/>
+          <w:rFonts w:ascii="Times New Roman" w:hAnsi="Times New Roman"/>
+          <w:sz w:val="24"/>
         </w:rPr>
         <w:t xml:space="preserve">    print("\nDictionary:")</w:t>
       </w:r>
@@ -2649,11 +2843,12 @@
     <w:p>
       <w:pPr>
         <w:spacing w:before="0" w:after="0" w:line="252" w:lineRule="auto"/>
+        <w:jc w:val="left"/>
       </w:pPr>
       <w:r>
         <w:rPr>
-          <w:rFonts w:ascii="Courier New" w:hAnsi="Courier New"/>
-          <w:sz w:val="20"/>
+          <w:rFonts w:ascii="Times New Roman" w:hAnsi="Times New Roman"/>
+          <w:sz w:val="24"/>
         </w:rPr>
         <w:t xml:space="preserve">    print(dictionary)</w:t>
       </w:r>
@@ -2661,11 +2856,12 @@
     <w:p>
       <w:pPr>
         <w:spacing w:before="0" w:after="0" w:line="252" w:lineRule="auto"/>
+        <w:jc w:val="left"/>
       </w:pPr>
       <w:r>
         <w:rPr>
-          <w:rFonts w:ascii="Courier New" w:hAnsi="Courier New"/>
-          <w:sz w:val="20"/>
+          <w:rFonts w:ascii="Times New Roman" w:hAnsi="Times New Roman"/>
+          <w:sz w:val="24"/>
         </w:rPr>
         <w:t xml:space="preserve"> </w:t>
       </w:r>
@@ -2673,11 +2869,12 @@
     <w:p>
       <w:pPr>
         <w:spacing w:before="0" w:after="0" w:line="252" w:lineRule="auto"/>
+        <w:jc w:val="left"/>
       </w:pPr>
       <w:r>
         <w:rPr>
-          <w:rFonts w:ascii="Courier New" w:hAnsi="Courier New"/>
-          <w:sz w:val="20"/>
+          <w:rFonts w:ascii="Times New Roman" w:hAnsi="Times New Roman"/>
+          <w:sz w:val="24"/>
         </w:rPr>
         <w:t>letters, digits, words = get_input()</w:t>
       </w:r>
@@ -2685,11 +2882,12 @@
     <w:p>
       <w:pPr>
         <w:spacing w:before="0" w:after="0" w:line="252" w:lineRule="auto"/>
+        <w:jc w:val="left"/>
       </w:pPr>
       <w:r>
         <w:rPr>
-          <w:rFonts w:ascii="Courier New" w:hAnsi="Courier New"/>
-          <w:sz w:val="20"/>
+          <w:rFonts w:ascii="Times New Roman" w:hAnsi="Times New Roman"/>
+          <w:sz w:val="24"/>
         </w:rPr>
         <w:t>if len(letters) != len(digits) or len(letters) != len(words):</w:t>
       </w:r>
@@ -2697,11 +2895,12 @@
     <w:p>
       <w:pPr>
         <w:spacing w:before="0" w:after="0" w:line="252" w:lineRule="auto"/>
+        <w:jc w:val="left"/>
       </w:pPr>
       <w:r>
         <w:rPr>
-          <w:rFonts w:ascii="Courier New" w:hAnsi="Courier New"/>
-          <w:sz w:val="20"/>
+          <w:rFonts w:ascii="Times New Roman" w:hAnsi="Times New Roman"/>
+          <w:sz w:val="24"/>
         </w:rPr>
         <w:t xml:space="preserve">    print("Error: All three inputs must contain the same number of elements.")</w:t>
       </w:r>
@@ -2709,11 +2908,12 @@
     <w:p>
       <w:pPr>
         <w:spacing w:before="0" w:after="0" w:line="252" w:lineRule="auto"/>
+        <w:jc w:val="left"/>
       </w:pPr>
       <w:r>
         <w:rPr>
-          <w:rFonts w:ascii="Courier New" w:hAnsi="Courier New"/>
-          <w:sz w:val="20"/>
+          <w:rFonts w:ascii="Times New Roman" w:hAnsi="Times New Roman"/>
+          <w:sz w:val="24"/>
         </w:rPr>
         <w:t>else:</w:t>
       </w:r>
@@ -2721,11 +2921,12 @@
     <w:p>
       <w:pPr>
         <w:spacing w:before="0" w:after="0" w:line="252" w:lineRule="auto"/>
+        <w:jc w:val="left"/>
       </w:pPr>
       <w:r>
         <w:rPr>
-          <w:rFonts w:ascii="Courier New" w:hAnsi="Courier New"/>
-          <w:sz w:val="20"/>
+          <w:rFonts w:ascii="Times New Roman" w:hAnsi="Times New Roman"/>
+          <w:sz w:val="24"/>
         </w:rPr>
         <w:t xml:space="preserve">    dictionary = create_dictionary(letters, digits, words)</w:t>
       </w:r>
@@ -2733,11 +2934,12 @@
     <w:p>
       <w:pPr>
         <w:spacing w:before="0" w:after="0" w:line="252" w:lineRule="auto"/>
+        <w:jc w:val="left"/>
       </w:pPr>
       <w:r>
         <w:rPr>
-          <w:rFonts w:ascii="Courier New" w:hAnsi="Courier New"/>
-          <w:sz w:val="20"/>
+          <w:rFonts w:ascii="Times New Roman" w:hAnsi="Times New Roman"/>
+          <w:sz w:val="24"/>
         </w:rPr>
         <w:t xml:space="preserve">    display_dictionary(dictionary)</w:t>
       </w:r>
@@ -2747,17 +2949,22 @@
       <w:tblPr>
         <w:tblW w:type="auto" w:w="0"/>
         <w:jc w:val="right"/>
+        <w:tblLook w:firstColumn="1" w:firstRow="1" w:lastColumn="0" w:lastRow="0" w:noHBand="0" w:noVBand="1" w:val="04A0"/>
         <w:tblLayout w:type="fixed"/>
-        <w:tblLook w:firstColumn="1" w:firstRow="1" w:lastColumn="0" w:lastRow="0" w:noHBand="0" w:noVBand="1" w:val="04A0"/>
       </w:tblPr>
       <w:tblGrid>
-        <w:gridCol w:w="4874"/>
-        <w:gridCol w:w="4874"/>
+        <w:gridCol w:w="3600"/>
+        <w:gridCol w:w="2160"/>
       </w:tblGrid>
       <w:tr>
+        <w:trPr>
+          <w:trHeight w:val="400" w:hRule="atLeast"/>
+        </w:trPr>
         <w:tc>
           <w:tcPr>
-            <w:tcW w:type="dxa" w:w="3600"/>
+            <w:tcW w:type="dxa" w:w="4874"/>
+            <w:tcW w:w="3600" w:type="dxa"/>
+            <w:vAlign w:val="center"/>
             <w:tcBorders>
               <w:top w:val="single" w:sz="6" w:space="0" w:color="000000"/>
               <w:left w:val="single" w:sz="6" w:space="0" w:color="000000"/>
@@ -2781,7 +2988,9 @@
         </w:tc>
         <w:tc>
           <w:tcPr>
-            <w:tcW w:type="dxa" w:w="2160"/>
+            <w:tcW w:type="dxa" w:w="4874"/>
+            <w:tcW w:w="2160" w:type="dxa"/>
+            <w:vAlign w:val="center"/>
             <w:tcBorders>
               <w:top w:val="single" w:sz="6" w:space="0" w:color="000000"/>
               <w:left w:val="single" w:sz="6" w:space="0" w:color="000000"/>
@@ -2797,9 +3006,14 @@
         </w:tc>
       </w:tr>
       <w:tr>
+        <w:trPr>
+          <w:trHeight w:val="400" w:hRule="atLeast"/>
+        </w:trPr>
         <w:tc>
           <w:tcPr>
-            <w:tcW w:type="dxa" w:w="3600"/>
+            <w:tcW w:type="dxa" w:w="4874"/>
+            <w:tcW w:w="3600" w:type="dxa"/>
+            <w:vAlign w:val="center"/>
             <w:tcBorders>
               <w:top w:val="single" w:sz="6" w:space="0" w:color="000000"/>
               <w:left w:val="single" w:sz="6" w:space="0" w:color="000000"/>
@@ -2823,7 +3037,9 @@
         </w:tc>
         <w:tc>
           <w:tcPr>
-            <w:tcW w:type="dxa" w:w="2160"/>
+            <w:tcW w:type="dxa" w:w="4874"/>
+            <w:tcW w:w="2160" w:type="dxa"/>
+            <w:vAlign w:val="center"/>
             <w:tcBorders>
               <w:top w:val="single" w:sz="6" w:space="0" w:color="000000"/>
               <w:left w:val="single" w:sz="6" w:space="0" w:color="000000"/>
@@ -2839,9 +3055,14 @@
         </w:tc>
       </w:tr>
       <w:tr>
+        <w:trPr>
+          <w:trHeight w:val="400" w:hRule="atLeast"/>
+        </w:trPr>
         <w:tc>
           <w:tcPr>
-            <w:tcW w:type="dxa" w:w="3600"/>
+            <w:tcW w:type="dxa" w:w="4874"/>
+            <w:tcW w:w="3600" w:type="dxa"/>
+            <w:vAlign w:val="center"/>
             <w:tcBorders>
               <w:top w:val="single" w:sz="6" w:space="0" w:color="000000"/>
               <w:left w:val="single" w:sz="6" w:space="0" w:color="000000"/>
@@ -2865,7 +3086,9 @@
         </w:tc>
         <w:tc>
           <w:tcPr>
-            <w:tcW w:type="dxa" w:w="2160"/>
+            <w:tcW w:type="dxa" w:w="4874"/>
+            <w:tcW w:w="2160" w:type="dxa"/>
+            <w:vAlign w:val="center"/>
             <w:tcBorders>
               <w:top w:val="single" w:sz="6" w:space="0" w:color="000000"/>
               <w:left w:val="single" w:sz="6" w:space="0" w:color="000000"/>
@@ -2881,9 +3104,14 @@
         </w:tc>
       </w:tr>
       <w:tr>
+        <w:trPr>
+          <w:trHeight w:val="400" w:hRule="atLeast"/>
+        </w:trPr>
         <w:tc>
           <w:tcPr>
-            <w:tcW w:type="dxa" w:w="3600"/>
+            <w:tcW w:type="dxa" w:w="4874"/>
+            <w:tcW w:w="3600" w:type="dxa"/>
+            <w:vAlign w:val="center"/>
             <w:tcBorders>
               <w:top w:val="single" w:sz="6" w:space="0" w:color="000000"/>
               <w:left w:val="single" w:sz="6" w:space="0" w:color="000000"/>
@@ -2907,7 +3135,9 @@
         </w:tc>
         <w:tc>
           <w:tcPr>
-            <w:tcW w:type="dxa" w:w="2160"/>
+            <w:tcW w:type="dxa" w:w="4874"/>
+            <w:tcW w:w="2160" w:type="dxa"/>
+            <w:vAlign w:val="center"/>
             <w:tcBorders>
               <w:top w:val="single" w:sz="6" w:space="0" w:color="000000"/>
               <w:left w:val="single" w:sz="6" w:space="0" w:color="000000"/>
@@ -2944,6 +3174,7 @@
     <w:p>
       <w:pPr>
         <w:spacing w:before="40" w:after="120" w:line="276" w:lineRule="auto"/>
+        <w:jc w:val="both"/>
       </w:pPr>
       <w:r>
         <w:rPr>

</xml_diff>